<commit_message>
Add Tea to task list
</commit_message>
<xml_diff>
--- a/20596322_Group20_Lab8.docx
+++ b/20596322_Group20_Lab8.docx
@@ -276,7 +276,7 @@
                     <pic:cNvPicPr/>
                   </pic:nvPicPr>
                   <pic:blipFill>
-                    <a:blip r:embed="rId4">
+                    <a:blip r:embed="rId6">
                       <a:extLst>
                         <a:ext uri="{28A0092B-C50C-407E-A947-70E740481C1C}">
                           <a14:useLocalDpi xmlns:a14="http://schemas.microsoft.com/office/drawing/2010/main" val="0"/>
@@ -410,7 +410,7 @@
                     <pic:cNvPicPr/>
                   </pic:nvPicPr>
                   <pic:blipFill>
-                    <a:blip r:embed="rId5">
+                    <a:blip r:embed="rId7">
                       <a:extLst>
                         <a:ext uri="{28A0092B-C50C-407E-A947-70E740481C1C}">
                           <a14:useLocalDpi xmlns:a14="http://schemas.microsoft.com/office/drawing/2010/main" val="0"/>
@@ -508,32 +508,886 @@
           <w:sz w:val="24"/>
           <w:szCs w:val="24"/>
         </w:rPr>
-        <w:t>When Docker Compose brings up the stack, it places both the app and database containers on the same secure internal network. Containers on the same Docker network can communicate with each other freely across any port, so the database port (27017) does not need to be mapped to the host machine or exposed publicly for the Node app to reach it.</w:t>
-      </w:r>
+        <w:t>I chose MongoDB for this lab. The app container uses the database service name because Docker Compose creates a custom internal network with automatic DNS resolution, which dynamically routes the service name to the correct container's internal IP address, whereas localhost would point to the app container itself.</w:t>
+      </w:r>
+    </w:p>
+    <w:p>
+      <w:pPr>
+        <w:rPr>
+          <w:sz w:val="24"/>
+          <w:szCs w:val="24"/>
+        </w:rPr>
+      </w:pPr>
+    </w:p>
+    <w:p>
+      <w:pPr>
+        <w:rPr>
+          <w:b/>
+          <w:bCs/>
+          <w:color w:val="4C94D8" w:themeColor="text2" w:themeTint="80"/>
+          <w:sz w:val="28"/>
+          <w:szCs w:val="28"/>
+        </w:rPr>
+      </w:pPr>
+      <w:r>
+        <w:rPr>
+          <w:b/>
+          <w:bCs/>
+          <w:color w:val="4C94D8" w:themeColor="text2" w:themeTint="80"/>
+          <w:sz w:val="28"/>
+          <w:szCs w:val="28"/>
+        </w:rPr>
+        <w:t>Task 2 – Update the Pipeline to Deploy the Compose Stack</w:t>
+      </w:r>
+      <w:r>
+        <w:rPr>
+          <w:b/>
+          <w:bCs/>
+          <w:color w:val="4C94D8" w:themeColor="text2" w:themeTint="80"/>
+          <w:sz w:val="28"/>
+          <w:szCs w:val="28"/>
+        </w:rPr>
+        <w:t>:</w:t>
+      </w:r>
+    </w:p>
+    <w:p>
+      <w:pPr>
+        <w:rPr>
+          <w:b/>
+          <w:bCs/>
+          <w:sz w:val="24"/>
+          <w:szCs w:val="24"/>
+        </w:rPr>
+      </w:pPr>
+      <w:r>
+        <w:rPr>
+          <w:b/>
+          <w:bCs/>
+          <w:sz w:val="24"/>
+          <w:szCs w:val="24"/>
+        </w:rPr>
+        <w:t xml:space="preserve">- </w:t>
+      </w:r>
+      <w:r>
+        <w:rPr>
+          <w:b/>
+          <w:bCs/>
+          <w:sz w:val="24"/>
+          <w:szCs w:val="24"/>
+        </w:rPr>
+        <w:t>Screenshot of the GitHub Actions run showing all steps green</w:t>
+      </w:r>
+      <w:r>
+        <w:rPr>
+          <w:b/>
+          <w:bCs/>
+          <w:sz w:val="24"/>
+          <w:szCs w:val="24"/>
+        </w:rPr>
+        <w:t>:</w:t>
+      </w:r>
+    </w:p>
+    <w:p>
+      <w:pPr>
+        <w:rPr>
+          <w:b/>
+          <w:bCs/>
+          <w:sz w:val="24"/>
+          <w:szCs w:val="24"/>
+        </w:rPr>
+      </w:pPr>
+      <w:r>
+        <w:rPr>
+          <w:b/>
+          <w:bCs/>
+          <w:noProof/>
+          <w:sz w:val="24"/>
+          <w:szCs w:val="24"/>
+        </w:rPr>
+        <w:drawing>
+          <wp:inline distT="0" distB="0" distL="0" distR="0" wp14:anchorId="3E58BBD0" wp14:editId="51DFD1A8">
+            <wp:extent cx="5999018" cy="3073992"/>
+            <wp:effectExtent l="0" t="0" r="1905" b="0"/>
+            <wp:docPr id="1487787908" name="Picture 10"/>
+            <wp:cNvGraphicFramePr>
+              <a:graphicFrameLocks xmlns:a="http://schemas.openxmlformats.org/drawingml/2006/main" noChangeAspect="1"/>
+            </wp:cNvGraphicFramePr>
+            <a:graphic xmlns:a="http://schemas.openxmlformats.org/drawingml/2006/main">
+              <a:graphicData uri="http://schemas.openxmlformats.org/drawingml/2006/picture">
+                <pic:pic xmlns:pic="http://schemas.openxmlformats.org/drawingml/2006/picture">
+                  <pic:nvPicPr>
+                    <pic:cNvPr id="1487787908" name="Picture 1487787908"/>
+                    <pic:cNvPicPr/>
+                  </pic:nvPicPr>
+                  <pic:blipFill rotWithShape="1">
+                    <a:blip r:embed="rId8" cstate="print">
+                      <a:extLst>
+                        <a:ext uri="{28A0092B-C50C-407E-A947-70E740481C1C}">
+                          <a14:useLocalDpi xmlns:a14="http://schemas.microsoft.com/office/drawing/2010/main" val="0"/>
+                        </a:ext>
+                      </a:extLst>
+                    </a:blip>
+                    <a:srcRect b="4327"/>
+                    <a:stretch>
+                      <a:fillRect/>
+                    </a:stretch>
+                  </pic:blipFill>
+                  <pic:spPr bwMode="auto">
+                    <a:xfrm>
+                      <a:off x="0" y="0"/>
+                      <a:ext cx="6000995" cy="3075005"/>
+                    </a:xfrm>
+                    <a:prstGeom prst="rect">
+                      <a:avLst/>
+                    </a:prstGeom>
+                    <a:ln>
+                      <a:noFill/>
+                    </a:ln>
+                    <a:extLst>
+                      <a:ext uri="{53640926-AAD7-44D8-BBD7-CCE9431645EC}">
+                        <a14:shadowObscured xmlns:a14="http://schemas.microsoft.com/office/drawing/2010/main"/>
+                      </a:ext>
+                    </a:extLst>
+                  </pic:spPr>
+                </pic:pic>
+              </a:graphicData>
+            </a:graphic>
+          </wp:inline>
+        </w:drawing>
+      </w:r>
+    </w:p>
+    <w:p>
+      <w:pPr>
+        <w:rPr>
+          <w:b/>
+          <w:bCs/>
+          <w:sz w:val="24"/>
+          <w:szCs w:val="24"/>
+        </w:rPr>
+      </w:pPr>
+      <w:r>
+        <w:rPr>
+          <w:b/>
+          <w:bCs/>
+          <w:sz w:val="24"/>
+          <w:szCs w:val="24"/>
+        </w:rPr>
+        <w:lastRenderedPageBreak/>
+        <w:t xml:space="preserve">- Screenshot of </w:t>
+      </w:r>
+      <w:r>
+        <w:rPr>
+          <w:b/>
+          <w:bCs/>
+          <w:i/>
+          <w:iCs/>
+          <w:color w:val="215E99" w:themeColor="text2" w:themeTint="BF"/>
+          <w:sz w:val="24"/>
+          <w:szCs w:val="24"/>
+        </w:rPr>
+        <w:t xml:space="preserve">docker </w:t>
+      </w:r>
+      <w:proofErr w:type="gramStart"/>
+      <w:r>
+        <w:rPr>
+          <w:b/>
+          <w:bCs/>
+          <w:i/>
+          <w:iCs/>
+          <w:color w:val="215E99" w:themeColor="text2" w:themeTint="BF"/>
+          <w:sz w:val="24"/>
+          <w:szCs w:val="24"/>
+        </w:rPr>
+        <w:t>compose</w:t>
+      </w:r>
+      <w:proofErr w:type="gramEnd"/>
+      <w:r>
+        <w:rPr>
+          <w:b/>
+          <w:bCs/>
+          <w:i/>
+          <w:iCs/>
+          <w:color w:val="215E99" w:themeColor="text2" w:themeTint="BF"/>
+          <w:sz w:val="24"/>
+          <w:szCs w:val="24"/>
+        </w:rPr>
+        <w:t xml:space="preserve"> </w:t>
+      </w:r>
+      <w:proofErr w:type="spellStart"/>
+      <w:r>
+        <w:rPr>
+          <w:b/>
+          <w:bCs/>
+          <w:i/>
+          <w:iCs/>
+          <w:color w:val="215E99" w:themeColor="text2" w:themeTint="BF"/>
+          <w:sz w:val="24"/>
+          <w:szCs w:val="24"/>
+        </w:rPr>
+        <w:t>ps</w:t>
+      </w:r>
+      <w:proofErr w:type="spellEnd"/>
+      <w:r>
+        <w:rPr>
+          <w:b/>
+          <w:bCs/>
+          <w:i/>
+          <w:iCs/>
+          <w:color w:val="215E99" w:themeColor="text2" w:themeTint="BF"/>
+          <w:sz w:val="24"/>
+          <w:szCs w:val="24"/>
+        </w:rPr>
+        <w:t xml:space="preserve"> </w:t>
+      </w:r>
+      <w:r>
+        <w:rPr>
+          <w:b/>
+          <w:bCs/>
+          <w:sz w:val="24"/>
+          <w:szCs w:val="24"/>
+        </w:rPr>
+        <w:t>showing</w:t>
+      </w:r>
+      <w:r>
+        <w:rPr>
+          <w:b/>
+          <w:bCs/>
+          <w:sz w:val="24"/>
+          <w:szCs w:val="24"/>
+        </w:rPr>
+        <w:t xml:space="preserve"> </w:t>
+      </w:r>
+      <w:r>
+        <w:rPr>
+          <w:b/>
+          <w:bCs/>
+          <w:sz w:val="24"/>
+          <w:szCs w:val="24"/>
+        </w:rPr>
+        <w:t>both containers running after the automated deploy</w:t>
+      </w:r>
+      <w:r>
+        <w:rPr>
+          <w:b/>
+          <w:bCs/>
+          <w:sz w:val="24"/>
+          <w:szCs w:val="24"/>
+        </w:rPr>
+        <w:t>:</w:t>
+      </w:r>
+    </w:p>
+    <w:p>
+      <w:pPr>
+        <w:rPr>
+          <w:b/>
+          <w:bCs/>
+          <w:sz w:val="24"/>
+          <w:szCs w:val="24"/>
+        </w:rPr>
+      </w:pPr>
+      <w:r>
+        <w:rPr>
+          <w:b/>
+          <w:bCs/>
+          <w:noProof/>
+          <w:sz w:val="24"/>
+          <w:szCs w:val="24"/>
+        </w:rPr>
+        <w:drawing>
+          <wp:inline distT="0" distB="0" distL="0" distR="0" wp14:anchorId="1F0B4547" wp14:editId="4DE9E5A6">
+            <wp:extent cx="6583680" cy="746125"/>
+            <wp:effectExtent l="0" t="0" r="7620" b="0"/>
+            <wp:docPr id="242442258" name="Picture 11"/>
+            <wp:cNvGraphicFramePr>
+              <a:graphicFrameLocks xmlns:a="http://schemas.openxmlformats.org/drawingml/2006/main" noChangeAspect="1"/>
+            </wp:cNvGraphicFramePr>
+            <a:graphic xmlns:a="http://schemas.openxmlformats.org/drawingml/2006/main">
+              <a:graphicData uri="http://schemas.openxmlformats.org/drawingml/2006/picture">
+                <pic:pic xmlns:pic="http://schemas.openxmlformats.org/drawingml/2006/picture">
+                  <pic:nvPicPr>
+                    <pic:cNvPr id="242442258" name="Picture 242442258"/>
+                    <pic:cNvPicPr/>
+                  </pic:nvPicPr>
+                  <pic:blipFill>
+                    <a:blip r:embed="rId9">
+                      <a:extLst>
+                        <a:ext uri="{28A0092B-C50C-407E-A947-70E740481C1C}">
+                          <a14:useLocalDpi xmlns:a14="http://schemas.microsoft.com/office/drawing/2010/main" val="0"/>
+                        </a:ext>
+                      </a:extLst>
+                    </a:blip>
+                    <a:stretch>
+                      <a:fillRect/>
+                    </a:stretch>
+                  </pic:blipFill>
+                  <pic:spPr>
+                    <a:xfrm>
+                      <a:off x="0" y="0"/>
+                      <a:ext cx="6583680" cy="746125"/>
+                    </a:xfrm>
+                    <a:prstGeom prst="rect">
+                      <a:avLst/>
+                    </a:prstGeom>
+                  </pic:spPr>
+                </pic:pic>
+              </a:graphicData>
+            </a:graphic>
+          </wp:inline>
+        </w:drawing>
+      </w:r>
+    </w:p>
+    <w:p>
+      <w:pPr>
+        <w:rPr>
+          <w:b/>
+          <w:bCs/>
+          <w:sz w:val="24"/>
+          <w:szCs w:val="24"/>
+        </w:rPr>
+      </w:pPr>
+    </w:p>
+    <w:p>
+      <w:pPr>
+        <w:rPr>
+          <w:b/>
+          <w:bCs/>
+          <w:sz w:val="24"/>
+          <w:szCs w:val="24"/>
+        </w:rPr>
+      </w:pPr>
+      <w:r>
+        <w:rPr>
+          <w:b/>
+          <w:bCs/>
+          <w:sz w:val="24"/>
+          <w:szCs w:val="24"/>
+        </w:rPr>
+        <w:t xml:space="preserve">- Screenshot of </w:t>
+      </w:r>
+      <w:r>
+        <w:rPr>
+          <w:b/>
+          <w:bCs/>
+          <w:i/>
+          <w:iCs/>
+          <w:color w:val="215E99" w:themeColor="text2" w:themeTint="BF"/>
+          <w:sz w:val="24"/>
+          <w:szCs w:val="24"/>
+        </w:rPr>
+        <w:t>curl localhost:3000/tasks</w:t>
+      </w:r>
+      <w:r>
+        <w:rPr>
+          <w:b/>
+          <w:bCs/>
+          <w:i/>
+          <w:iCs/>
+          <w:color w:val="215E99" w:themeColor="text2" w:themeTint="BF"/>
+          <w:sz w:val="24"/>
+          <w:szCs w:val="24"/>
+        </w:rPr>
+        <w:t xml:space="preserve"> </w:t>
+      </w:r>
+      <w:r>
+        <w:rPr>
+          <w:b/>
+          <w:bCs/>
+          <w:sz w:val="24"/>
+          <w:szCs w:val="24"/>
+        </w:rPr>
+        <w:t>showing data returned from the database</w:t>
+      </w:r>
+      <w:r>
+        <w:rPr>
+          <w:b/>
+          <w:bCs/>
+          <w:sz w:val="24"/>
+          <w:szCs w:val="24"/>
+        </w:rPr>
+        <w:t>:</w:t>
+      </w:r>
+    </w:p>
+    <w:p>
+      <w:pPr>
+        <w:rPr>
+          <w:b/>
+          <w:bCs/>
+          <w:sz w:val="24"/>
+          <w:szCs w:val="24"/>
+        </w:rPr>
+      </w:pPr>
+      <w:r>
+        <w:rPr>
+          <w:b/>
+          <w:bCs/>
+          <w:noProof/>
+          <w:sz w:val="24"/>
+          <w:szCs w:val="24"/>
+        </w:rPr>
+        <w:drawing>
+          <wp:inline distT="0" distB="0" distL="0" distR="0" wp14:anchorId="40297404" wp14:editId="089969FA">
+            <wp:extent cx="6733309" cy="483177"/>
+            <wp:effectExtent l="0" t="0" r="0" b="0"/>
+            <wp:docPr id="1837995331" name="Picture 12"/>
+            <wp:cNvGraphicFramePr>
+              <a:graphicFrameLocks xmlns:a="http://schemas.openxmlformats.org/drawingml/2006/main" noChangeAspect="1"/>
+            </wp:cNvGraphicFramePr>
+            <a:graphic xmlns:a="http://schemas.openxmlformats.org/drawingml/2006/main">
+              <a:graphicData uri="http://schemas.openxmlformats.org/drawingml/2006/picture">
+                <pic:pic xmlns:pic="http://schemas.openxmlformats.org/drawingml/2006/picture">
+                  <pic:nvPicPr>
+                    <pic:cNvPr id="1837995331" name="Picture 1837995331"/>
+                    <pic:cNvPicPr/>
+                  </pic:nvPicPr>
+                  <pic:blipFill>
+                    <a:blip r:embed="rId10">
+                      <a:extLst>
+                        <a:ext uri="{28A0092B-C50C-407E-A947-70E740481C1C}">
+                          <a14:useLocalDpi xmlns:a14="http://schemas.microsoft.com/office/drawing/2010/main" val="0"/>
+                        </a:ext>
+                      </a:extLst>
+                    </a:blip>
+                    <a:stretch>
+                      <a:fillRect/>
+                    </a:stretch>
+                  </pic:blipFill>
+                  <pic:spPr>
+                    <a:xfrm>
+                      <a:off x="0" y="0"/>
+                      <a:ext cx="6829537" cy="490082"/>
+                    </a:xfrm>
+                    <a:prstGeom prst="rect">
+                      <a:avLst/>
+                    </a:prstGeom>
+                  </pic:spPr>
+                </pic:pic>
+              </a:graphicData>
+            </a:graphic>
+          </wp:inline>
+        </w:drawing>
+      </w:r>
+    </w:p>
+    <w:p>
+      <w:pPr>
+        <w:rPr>
+          <w:b/>
+          <w:bCs/>
+          <w:sz w:val="24"/>
+          <w:szCs w:val="24"/>
+        </w:rPr>
+      </w:pPr>
     </w:p>
     <w:p>
       <w:pPr>
         <w:spacing w:line="276" w:lineRule="auto"/>
         <w:rPr>
-          <w:sz w:val="24"/>
-          <w:szCs w:val="24"/>
-        </w:rPr>
-      </w:pPr>
+          <w:b/>
+          <w:bCs/>
+          <w:sz w:val="24"/>
+          <w:szCs w:val="24"/>
+        </w:rPr>
+      </w:pPr>
+      <w:r>
+        <w:rPr>
+          <w:b/>
+          <w:bCs/>
+          <w:sz w:val="24"/>
+          <w:szCs w:val="24"/>
+        </w:rPr>
+        <w:t>- A</w:t>
+      </w:r>
+      <w:r>
+        <w:rPr>
+          <w:b/>
+          <w:bCs/>
+          <w:sz w:val="24"/>
+          <w:szCs w:val="24"/>
+        </w:rPr>
+        <w:t xml:space="preserve">nswer to Write-up </w:t>
+      </w:r>
+      <w:r>
+        <w:rPr>
+          <w:b/>
+          <w:bCs/>
+          <w:sz w:val="24"/>
+          <w:szCs w:val="24"/>
+        </w:rPr>
+        <w:t>2</w:t>
+      </w:r>
+      <w:r>
+        <w:rPr>
+          <w:b/>
+          <w:bCs/>
+          <w:sz w:val="24"/>
+          <w:szCs w:val="24"/>
+        </w:rPr>
+        <w:t>:</w:t>
+      </w:r>
     </w:p>
     <w:p>
       <w:pPr>
         <w:spacing w:line="276" w:lineRule="auto"/>
         <w:rPr>
-          <w:sz w:val="24"/>
-          <w:szCs w:val="24"/>
-        </w:rPr>
-      </w:pPr>
-    </w:p>
-    <w:p>
-      <w:pPr>
-        <w:rPr>
-          <w:sz w:val="24"/>
-          <w:szCs w:val="24"/>
+          <w:b/>
+          <w:bCs/>
+          <w:color w:val="000000" w:themeColor="text1"/>
+          <w:sz w:val="24"/>
+          <w:szCs w:val="24"/>
+        </w:rPr>
+      </w:pPr>
+      <w:r>
+        <w:rPr>
+          <w:b/>
+          <w:bCs/>
+          <w:sz w:val="24"/>
+          <w:szCs w:val="24"/>
+        </w:rPr>
+        <w:t>T</w:t>
+      </w:r>
+      <w:r>
+        <w:rPr>
+          <w:b/>
+          <w:bCs/>
+          <w:sz w:val="24"/>
+          <w:szCs w:val="24"/>
+        </w:rPr>
+        <w:t xml:space="preserve">he output of </w:t>
+      </w:r>
+      <w:r>
+        <w:rPr>
+          <w:b/>
+          <w:bCs/>
+          <w:color w:val="215E99" w:themeColor="text2" w:themeTint="BF"/>
+          <w:sz w:val="24"/>
+          <w:szCs w:val="24"/>
+        </w:rPr>
+        <w:t xml:space="preserve">docker </w:t>
+      </w:r>
+      <w:proofErr w:type="gramStart"/>
+      <w:r>
+        <w:rPr>
+          <w:b/>
+          <w:bCs/>
+          <w:color w:val="215E99" w:themeColor="text2" w:themeTint="BF"/>
+          <w:sz w:val="24"/>
+          <w:szCs w:val="24"/>
+        </w:rPr>
+        <w:t>compose</w:t>
+      </w:r>
+      <w:proofErr w:type="gramEnd"/>
+      <w:r>
+        <w:rPr>
+          <w:b/>
+          <w:bCs/>
+          <w:color w:val="215E99" w:themeColor="text2" w:themeTint="BF"/>
+          <w:sz w:val="24"/>
+          <w:szCs w:val="24"/>
+        </w:rPr>
+        <w:t xml:space="preserve"> </w:t>
+      </w:r>
+      <w:proofErr w:type="spellStart"/>
+      <w:r>
+        <w:rPr>
+          <w:b/>
+          <w:bCs/>
+          <w:color w:val="215E99" w:themeColor="text2" w:themeTint="BF"/>
+          <w:sz w:val="24"/>
+          <w:szCs w:val="24"/>
+        </w:rPr>
+        <w:t>ps</w:t>
+      </w:r>
+      <w:proofErr w:type="spellEnd"/>
+      <w:r>
+        <w:rPr>
+          <w:b/>
+          <w:bCs/>
+          <w:color w:val="000000" w:themeColor="text1"/>
+          <w:sz w:val="24"/>
+          <w:szCs w:val="24"/>
+        </w:rPr>
+        <w:t>:</w:t>
+      </w:r>
+    </w:p>
+    <w:p>
+      <w:pPr>
+        <w:rPr>
+          <w:color w:val="000000" w:themeColor="text1"/>
+          <w:sz w:val="24"/>
+          <w:szCs w:val="24"/>
+        </w:rPr>
+      </w:pPr>
+      <w:r>
+        <w:rPr>
+          <w:color w:val="000000" w:themeColor="text1"/>
+          <w:sz w:val="24"/>
+          <w:szCs w:val="24"/>
+        </w:rPr>
+        <w:t>NAME                   IMAGE                           COMMAND                  SERVICE    CREATED         STATUS         PORTS</w:t>
+      </w:r>
+    </w:p>
+    <w:p>
+      <w:pPr>
+        <w:rPr>
+          <w:color w:val="000000" w:themeColor="text1"/>
+          <w:sz w:val="24"/>
+          <w:szCs w:val="24"/>
+        </w:rPr>
+      </w:pPr>
+      <w:r>
+        <w:rPr>
+          <w:color w:val="000000" w:themeColor="text1"/>
+          <w:sz w:val="24"/>
+          <w:szCs w:val="24"/>
+        </w:rPr>
+        <w:t>lab8-cicd-app-1        basselessam47/lab8-</w:t>
+      </w:r>
+      <w:proofErr w:type="gramStart"/>
+      <w:r>
+        <w:rPr>
+          <w:color w:val="000000" w:themeColor="text1"/>
+          <w:sz w:val="24"/>
+          <w:szCs w:val="24"/>
+        </w:rPr>
+        <w:t>app:latest</w:t>
+      </w:r>
+      <w:proofErr w:type="gramEnd"/>
+      <w:r>
+        <w:rPr>
+          <w:color w:val="000000" w:themeColor="text1"/>
+          <w:sz w:val="24"/>
+          <w:szCs w:val="24"/>
+        </w:rPr>
+        <w:t xml:space="preserve">   "docker-</w:t>
+      </w:r>
+      <w:proofErr w:type="spellStart"/>
+      <w:proofErr w:type="gramStart"/>
+      <w:r>
+        <w:rPr>
+          <w:color w:val="000000" w:themeColor="text1"/>
+          <w:sz w:val="24"/>
+          <w:szCs w:val="24"/>
+        </w:rPr>
+        <w:t>entrypoint.s</w:t>
+      </w:r>
+      <w:proofErr w:type="spellEnd"/>
+      <w:proofErr w:type="gramEnd"/>
+      <w:r>
+        <w:rPr>
+          <w:color w:val="000000" w:themeColor="text1"/>
+          <w:sz w:val="24"/>
+          <w:szCs w:val="24"/>
+        </w:rPr>
+        <w:t>…"   app        5 minutes ago   Up 5 minutes   0.0.0.0:3000-&gt;3000/</w:t>
+      </w:r>
+      <w:proofErr w:type="spellStart"/>
+      <w:r>
+        <w:rPr>
+          <w:color w:val="000000" w:themeColor="text1"/>
+          <w:sz w:val="24"/>
+          <w:szCs w:val="24"/>
+        </w:rPr>
+        <w:t>tcp</w:t>
+      </w:r>
+      <w:proofErr w:type="spellEnd"/>
+      <w:r>
+        <w:rPr>
+          <w:color w:val="000000" w:themeColor="text1"/>
+          <w:sz w:val="24"/>
+          <w:szCs w:val="24"/>
+        </w:rPr>
+        <w:t xml:space="preserve">, </w:t>
+      </w:r>
+      <w:proofErr w:type="gramStart"/>
+      <w:r>
+        <w:rPr>
+          <w:color w:val="000000" w:themeColor="text1"/>
+          <w:sz w:val="24"/>
+          <w:szCs w:val="24"/>
+        </w:rPr>
+        <w:t>[::</w:t>
+      </w:r>
+      <w:proofErr w:type="gramEnd"/>
+      <w:r>
+        <w:rPr>
+          <w:color w:val="000000" w:themeColor="text1"/>
+          <w:sz w:val="24"/>
+          <w:szCs w:val="24"/>
+        </w:rPr>
+        <w:t>]:3000-&gt;3000/</w:t>
+      </w:r>
+      <w:proofErr w:type="spellStart"/>
+      <w:r>
+        <w:rPr>
+          <w:color w:val="000000" w:themeColor="text1"/>
+          <w:sz w:val="24"/>
+          <w:szCs w:val="24"/>
+        </w:rPr>
+        <w:t>tcp</w:t>
+      </w:r>
+      <w:proofErr w:type="spellEnd"/>
+    </w:p>
+    <w:p>
+      <w:pPr>
+        <w:rPr>
+          <w:color w:val="000000" w:themeColor="text1"/>
+          <w:sz w:val="24"/>
+          <w:szCs w:val="24"/>
+        </w:rPr>
+      </w:pPr>
+      <w:r>
+        <w:rPr>
+          <w:color w:val="000000" w:themeColor="text1"/>
+          <w:sz w:val="24"/>
+          <w:szCs w:val="24"/>
+        </w:rPr>
+        <w:t xml:space="preserve">lab8-cicd-database-1   </w:t>
+      </w:r>
+      <w:proofErr w:type="spellStart"/>
+      <w:proofErr w:type="gramStart"/>
+      <w:r>
+        <w:rPr>
+          <w:color w:val="000000" w:themeColor="text1"/>
+          <w:sz w:val="24"/>
+          <w:szCs w:val="24"/>
+        </w:rPr>
+        <w:t>mongo:latest</w:t>
+      </w:r>
+      <w:proofErr w:type="spellEnd"/>
+      <w:proofErr w:type="gramEnd"/>
+      <w:r>
+        <w:rPr>
+          <w:color w:val="000000" w:themeColor="text1"/>
+          <w:sz w:val="24"/>
+          <w:szCs w:val="24"/>
+        </w:rPr>
+        <w:t xml:space="preserve">                    "docker-</w:t>
+      </w:r>
+      <w:proofErr w:type="spellStart"/>
+      <w:proofErr w:type="gramStart"/>
+      <w:r>
+        <w:rPr>
+          <w:color w:val="000000" w:themeColor="text1"/>
+          <w:sz w:val="24"/>
+          <w:szCs w:val="24"/>
+        </w:rPr>
+        <w:t>entrypoint.s</w:t>
+      </w:r>
+      <w:proofErr w:type="spellEnd"/>
+      <w:proofErr w:type="gramEnd"/>
+      <w:r>
+        <w:rPr>
+          <w:color w:val="000000" w:themeColor="text1"/>
+          <w:sz w:val="24"/>
+          <w:szCs w:val="24"/>
+        </w:rPr>
+        <w:t>…"   database   5 minutes ago   Up 5 minutes   27017/</w:t>
+      </w:r>
+      <w:proofErr w:type="spellStart"/>
+      <w:r>
+        <w:rPr>
+          <w:color w:val="000000" w:themeColor="text1"/>
+          <w:sz w:val="24"/>
+          <w:szCs w:val="24"/>
+        </w:rPr>
+        <w:t>tcp</w:t>
+      </w:r>
+      <w:proofErr w:type="spellEnd"/>
+    </w:p>
+    <w:p>
+      <w:pPr>
+        <w:rPr>
+          <w:color w:val="4C94D8" w:themeColor="text2" w:themeTint="80"/>
+          <w:sz w:val="24"/>
+          <w:szCs w:val="24"/>
+        </w:rPr>
+      </w:pPr>
+    </w:p>
+    <w:p>
+      <w:pPr>
+        <w:rPr>
+          <w:sz w:val="24"/>
+          <w:szCs w:val="24"/>
+        </w:rPr>
+      </w:pPr>
+      <w:r>
+        <w:rPr>
+          <w:rStyle w:val="citation-699"/>
+          <w:sz w:val="24"/>
+          <w:szCs w:val="24"/>
+        </w:rPr>
+        <w:t xml:space="preserve">The two containers </w:t>
+      </w:r>
+      <w:r>
+        <w:rPr>
+          <w:rStyle w:val="citation-699"/>
+          <w:sz w:val="24"/>
+          <w:szCs w:val="24"/>
+        </w:rPr>
+        <w:t>can</w:t>
+      </w:r>
+      <w:r>
+        <w:rPr>
+          <w:rStyle w:val="citation-699"/>
+          <w:sz w:val="24"/>
+          <w:szCs w:val="24"/>
+        </w:rPr>
+        <w:t xml:space="preserve"> communicate because Docker Compose automatically creates a private internal bridge network where services can resolve each other by their service names, allowing the app to reach the database on its internal port without that port being exposed to the public host interface</w:t>
+      </w:r>
+      <w:r>
+        <w:rPr>
+          <w:sz w:val="24"/>
+          <w:szCs w:val="24"/>
+        </w:rPr>
+        <w:t>.</w:t>
+      </w:r>
+    </w:p>
+    <w:p>
+      <w:pPr>
+        <w:rPr>
+          <w:sz w:val="24"/>
+          <w:szCs w:val="24"/>
+        </w:rPr>
+      </w:pPr>
+    </w:p>
+    <w:p>
+      <w:pPr>
+        <w:rPr>
+          <w:b/>
+          <w:bCs/>
+          <w:color w:val="4C94D8" w:themeColor="text2" w:themeTint="80"/>
+          <w:sz w:val="28"/>
+          <w:szCs w:val="28"/>
+        </w:rPr>
+      </w:pPr>
+      <w:r>
+        <w:rPr>
+          <w:b/>
+          <w:bCs/>
+          <w:color w:val="4C94D8" w:themeColor="text2" w:themeTint="80"/>
+          <w:sz w:val="28"/>
+          <w:szCs w:val="28"/>
+        </w:rPr>
+        <w:t>Task 3 – Trigger a Full Round-Trip Change</w:t>
+      </w:r>
+      <w:r>
+        <w:rPr>
+          <w:b/>
+          <w:bCs/>
+          <w:color w:val="4C94D8" w:themeColor="text2" w:themeTint="80"/>
+          <w:sz w:val="28"/>
+          <w:szCs w:val="28"/>
+        </w:rPr>
+        <w:t>:</w:t>
+      </w:r>
+    </w:p>
+    <w:p>
+      <w:pPr>
+        <w:rPr>
+          <w:b/>
+          <w:bCs/>
+          <w:color w:val="4C94D8" w:themeColor="text2" w:themeTint="80"/>
+          <w:sz w:val="28"/>
+          <w:szCs w:val="28"/>
         </w:rPr>
       </w:pPr>
     </w:p>
@@ -545,6 +1399,44 @@
     </w:sectPr>
   </w:body>
 </w:document>
+</file>
+
+<file path=word/endnotes.xml><?xml version="1.0" encoding="utf-8"?>
+<w:endnotes xmlns:wpc="http://schemas.microsoft.com/office/word/2010/wordprocessingCanvas" xmlns:cx="http://schemas.microsoft.com/office/drawing/2014/chartex" xmlns:cx1="http://schemas.microsoft.com/office/drawing/2015/9/8/chartex" xmlns:cx2="http://schemas.microsoft.com/office/drawing/2015/10/21/chartex" xmlns:cx3="http://schemas.microsoft.com/office/drawing/2016/5/9/chartex" xmlns:cx4="http://schemas.microsoft.com/office/drawing/2016/5/10/chartex" xmlns:cx5="http://schemas.microsoft.com/office/drawing/2016/5/11/chartex" xmlns:cx6="http://schemas.microsoft.com/office/drawing/2016/5/12/chartex" xmlns:cx7="http://schemas.microsoft.com/office/drawing/2016/5/13/chartex" xmlns:cx8="http://schemas.microsoft.com/office/drawing/2016/5/14/chartex" xmlns:mc="http://schemas.openxmlformats.org/markup-compatibility/2006" xmlns:aink="http://schemas.microsoft.com/office/drawing/2016/ink" xmlns:am3d="http://schemas.microsoft.com/office/drawing/2017/model3d" xmlns:o="urn:schemas-microsoft-com:office:office" xmlns:oel="http://schemas.microsoft.com/office/2019/extlst" xmlns:r="http://schemas.openxmlformats.org/officeDocument/2006/relationships" xmlns:m="http://schemas.openxmlformats.org/officeDocument/2006/math" xmlns:v="urn:schemas-microsoft-com:vml" xmlns:wp14="http://schemas.microsoft.com/office/word/2010/wordprocessingDrawing" xmlns:wp="http://schemas.openxmlformats.org/drawingml/2006/wordprocessingDrawing" xmlns:w10="urn:schemas-microsoft-com:office:word" xmlns:w="http://schemas.openxmlformats.org/wordprocessingml/2006/main" xmlns:w14="http://schemas.microsoft.com/office/word/2010/wordml" xmlns:w15="http://schemas.microsoft.com/office/word/2012/wordml" xmlns:w16cex="http://schemas.microsoft.com/office/word/2018/wordml/cex" xmlns:w16cid="http://schemas.microsoft.com/office/word/2016/wordml/cid" xmlns:w16="http://schemas.microsoft.com/office/word/2018/wordml" xmlns:w16du="http://schemas.microsoft.com/office/word/2023/wordml/word16du" xmlns:w16sdtdh="http://schemas.microsoft.com/office/word/2020/wordml/sdtdatahash" xmlns:w16sdtfl="http://schemas.microsoft.com/office/word/2024/wordml/sdtformatlock" xmlns:w16se="http://schemas.microsoft.com/office/word/2015/wordml/symex" xmlns:wpg="http://schemas.microsoft.com/office/word/2010/wordprocessingGroup" xmlns:wpi="http://schemas.microsoft.com/office/word/2010/wordprocessingInk" xmlns:wne="http://schemas.microsoft.com/office/word/2006/wordml" xmlns:wps="http://schemas.microsoft.com/office/word/2010/wordprocessingShape" mc:Ignorable="w14 w15 w16se w16cid w16 w16cex w16sdtdh w16sdtfl w16du wp14">
+  <w:endnote w:type="separator" w:id="-1">
+    <w:p>
+      <w:r>
+        <w:separator/>
+      </w:r>
+    </w:p>
+  </w:endnote>
+  <w:endnote w:type="continuationSeparator" w:id="0">
+    <w:p>
+      <w:r>
+        <w:continuationSeparator/>
+      </w:r>
+    </w:p>
+  </w:endnote>
+</w:endnotes>
+</file>
+
+<file path=word/footnotes.xml><?xml version="1.0" encoding="utf-8"?>
+<w:footnotes xmlns:wpc="http://schemas.microsoft.com/office/word/2010/wordprocessingCanvas" xmlns:cx="http://schemas.microsoft.com/office/drawing/2014/chartex" xmlns:cx1="http://schemas.microsoft.com/office/drawing/2015/9/8/chartex" xmlns:cx2="http://schemas.microsoft.com/office/drawing/2015/10/21/chartex" xmlns:cx3="http://schemas.microsoft.com/office/drawing/2016/5/9/chartex" xmlns:cx4="http://schemas.microsoft.com/office/drawing/2016/5/10/chartex" xmlns:cx5="http://schemas.microsoft.com/office/drawing/2016/5/11/chartex" xmlns:cx6="http://schemas.microsoft.com/office/drawing/2016/5/12/chartex" xmlns:cx7="http://schemas.microsoft.com/office/drawing/2016/5/13/chartex" xmlns:cx8="http://schemas.microsoft.com/office/drawing/2016/5/14/chartex" xmlns:mc="http://schemas.openxmlformats.org/markup-compatibility/2006" xmlns:aink="http://schemas.microsoft.com/office/drawing/2016/ink" xmlns:am3d="http://schemas.microsoft.com/office/drawing/2017/model3d" xmlns:o="urn:schemas-microsoft-com:office:office" xmlns:oel="http://schemas.microsoft.com/office/2019/extlst" xmlns:r="http://schemas.openxmlformats.org/officeDocument/2006/relationships" xmlns:m="http://schemas.openxmlformats.org/officeDocument/2006/math" xmlns:v="urn:schemas-microsoft-com:vml" xmlns:wp14="http://schemas.microsoft.com/office/word/2010/wordprocessingDrawing" xmlns:wp="http://schemas.openxmlformats.org/drawingml/2006/wordprocessingDrawing" xmlns:w10="urn:schemas-microsoft-com:office:word" xmlns:w="http://schemas.openxmlformats.org/wordprocessingml/2006/main" xmlns:w14="http://schemas.microsoft.com/office/word/2010/wordml" xmlns:w15="http://schemas.microsoft.com/office/word/2012/wordml" xmlns:w16cex="http://schemas.microsoft.com/office/word/2018/wordml/cex" xmlns:w16cid="http://schemas.microsoft.com/office/word/2016/wordml/cid" xmlns:w16="http://schemas.microsoft.com/office/word/2018/wordml" xmlns:w16du="http://schemas.microsoft.com/office/word/2023/wordml/word16du" xmlns:w16sdtdh="http://schemas.microsoft.com/office/word/2020/wordml/sdtdatahash" xmlns:w16sdtfl="http://schemas.microsoft.com/office/word/2024/wordml/sdtformatlock" xmlns:w16se="http://schemas.microsoft.com/office/word/2015/wordml/symex" xmlns:wpg="http://schemas.microsoft.com/office/word/2010/wordprocessingGroup" xmlns:wpi="http://schemas.microsoft.com/office/word/2010/wordprocessingInk" xmlns:wne="http://schemas.microsoft.com/office/word/2006/wordml" xmlns:wps="http://schemas.microsoft.com/office/word/2010/wordprocessingShape" mc:Ignorable="w14 w15 w16se w16cid w16 w16cex w16sdtdh w16sdtfl w16du wp14">
+  <w:footnote w:type="separator" w:id="-1">
+    <w:p>
+      <w:r>
+        <w:separator/>
+      </w:r>
+    </w:p>
+  </w:footnote>
+  <w:footnote w:type="continuationSeparator" w:id="0">
+    <w:p>
+      <w:r>
+        <w:continuationSeparator/>
+      </w:r>
+    </w:p>
+  </w:footnote>
+</w:footnotes>
 </file>
 
 <file path=word/styles.xml><?xml version="1.0" encoding="utf-8"?>
@@ -943,7 +1835,7 @@
   <w:style w:type="paragraph" w:default="1" w:styleId="Normal">
     <w:name w:val="Normal"/>
     <w:qFormat/>
-    <w:rsid w:val="00724A7F"/>
+    <w:rsid w:val="0079066B"/>
   </w:style>
   <w:style w:type="paragraph" w:styleId="Heading1">
     <w:name w:val="heading 1"/>
@@ -1477,6 +2369,53 @@
       <w:sz w:val="18"/>
       <w:szCs w:val="18"/>
     </w:rPr>
+  </w:style>
+  <w:style w:type="paragraph" w:styleId="Header">
+    <w:name w:val="header"/>
+    <w:basedOn w:val="Normal"/>
+    <w:link w:val="HeaderChar"/>
+    <w:uiPriority w:val="99"/>
+    <w:unhideWhenUsed/>
+    <w:rsid w:val="00AF40E0"/>
+    <w:pPr>
+      <w:tabs>
+        <w:tab w:val="center" w:pos="4680"/>
+        <w:tab w:val="right" w:pos="9360"/>
+      </w:tabs>
+    </w:pPr>
+  </w:style>
+  <w:style w:type="character" w:customStyle="1" w:styleId="HeaderChar">
+    <w:name w:val="Header Char"/>
+    <w:basedOn w:val="DefaultParagraphFont"/>
+    <w:link w:val="Header"/>
+    <w:uiPriority w:val="99"/>
+    <w:rsid w:val="00AF40E0"/>
+  </w:style>
+  <w:style w:type="paragraph" w:styleId="Footer">
+    <w:name w:val="footer"/>
+    <w:basedOn w:val="Normal"/>
+    <w:link w:val="FooterChar"/>
+    <w:uiPriority w:val="99"/>
+    <w:unhideWhenUsed/>
+    <w:rsid w:val="00AF40E0"/>
+    <w:pPr>
+      <w:tabs>
+        <w:tab w:val="center" w:pos="4680"/>
+        <w:tab w:val="right" w:pos="9360"/>
+      </w:tabs>
+    </w:pPr>
+  </w:style>
+  <w:style w:type="character" w:customStyle="1" w:styleId="FooterChar">
+    <w:name w:val="Footer Char"/>
+    <w:basedOn w:val="DefaultParagraphFont"/>
+    <w:link w:val="Footer"/>
+    <w:uiPriority w:val="99"/>
+    <w:rsid w:val="00AF40E0"/>
+  </w:style>
+  <w:style w:type="character" w:customStyle="1" w:styleId="citation-699">
+    <w:name w:val="citation-699"/>
+    <w:basedOn w:val="DefaultParagraphFont"/>
+    <w:rsid w:val="00062EFE"/>
   </w:style>
 </w:styles>
 </file>

</xml_diff>